<commit_message>
Tree: Advanced Tree DFS questions solved
</commit_message>
<xml_diff>
--- a/07. Tree/Tree.docx
+++ b/07. Tree/Tree.docx
@@ -11346,6 +11346,930 @@
           <w:b/>
           <w:sz w:val="28"/>
         </w:rPr>
+        <w:t xml:space="preserve"> Advanced DFs</w:t>
+      </w:r>
+    </w:p>
+    <w:p>
+      <w:pPr>
+        <w:pStyle w:val="ListParagraph"/>
+        <w:numPr>
+          <w:ilvl w:val="0"/>
+          <w:numId w:val="41"/>
+        </w:numPr>
+        <w:rPr>
+          <w:bCs/>
+          <w:color w:val="FF0000"/>
+        </w:rPr>
+      </w:pPr>
+      <w:r>
+        <w:rPr>
+          <w:bCs/>
+          <w:color w:val="FF0000"/>
+        </w:rPr>
+        <w:t>Diameter of Binary Tree (543)</w:t>
+      </w:r>
+      <w:r>
+        <w:rPr>
+          <w:bCs/>
+          <w:color w:val="FF0000"/>
+        </w:rPr>
+        <w:tab/>
+      </w:r>
+      <w:proofErr w:type="spellStart"/>
+      <w:r>
+        <w:rPr>
+          <w:bCs/>
+          <w:color w:val="FF0000"/>
+        </w:rPr>
+        <w:t>LeetCode</w:t>
+      </w:r>
+      <w:proofErr w:type="spellEnd"/>
+      <w:r>
+        <w:rPr>
+          <w:bCs/>
+          <w:color w:val="FF0000"/>
+        </w:rPr>
+        <w:tab/>
+      </w:r>
+      <w:r>
+        <w:rPr>
+          <w:rFonts w:ascii="Calibri" w:hAnsi="Calibri" w:cs="Calibri"/>
+          <w:bCs/>
+          <w:color w:val="FF0000"/>
+        </w:rPr>
+        <w:t>🟢</w:t>
+      </w:r>
+      <w:r>
+        <w:rPr>
+          <w:bCs/>
+          <w:color w:val="FF0000"/>
+        </w:rPr>
+        <w:t xml:space="preserve"> Easy</w:t>
+      </w:r>
+    </w:p>
+    <w:p>
+      <w:pPr>
+        <w:pStyle w:val="ListParagraph"/>
+        <w:numPr>
+          <w:ilvl w:val="0"/>
+          <w:numId w:val="41"/>
+        </w:numPr>
+        <w:rPr>
+          <w:bCs/>
+        </w:rPr>
+      </w:pPr>
+      <w:r>
+        <w:rPr>
+          <w:bCs/>
+        </w:rPr>
+        <w:t>Count Good Nodes in Binary Tree (1448)</w:t>
+      </w:r>
+      <w:r>
+        <w:rPr>
+          <w:bCs/>
+        </w:rPr>
+        <w:tab/>
+      </w:r>
+      <w:proofErr w:type="spellStart"/>
+      <w:r>
+        <w:rPr>
+          <w:bCs/>
+        </w:rPr>
+        <w:t>LeetCode</w:t>
+      </w:r>
+      <w:proofErr w:type="spellEnd"/>
+      <w:r>
+        <w:rPr>
+          <w:bCs/>
+        </w:rPr>
+        <w:tab/>
+      </w:r>
+      <w:r>
+        <w:rPr>
+          <w:rFonts w:ascii="Calibri" w:hAnsi="Calibri" w:cs="Calibri"/>
+          <w:bCs/>
+        </w:rPr>
+        <w:t>🟡</w:t>
+      </w:r>
+      <w:r>
+        <w:rPr>
+          <w:bCs/>
+        </w:rPr>
+        <w:t xml:space="preserve"> Medium</w:t>
+      </w:r>
+    </w:p>
+    <w:p>
+      <w:pPr>
+        <w:pStyle w:val="ListParagraph"/>
+        <w:numPr>
+          <w:ilvl w:val="0"/>
+          <w:numId w:val="41"/>
+        </w:numPr>
+        <w:rPr>
+          <w:bCs/>
+        </w:rPr>
+      </w:pPr>
+      <w:r>
+        <w:rPr>
+          <w:bCs/>
+          <w:color w:val="FF0000"/>
+        </w:rPr>
+        <w:t xml:space="preserve">Longest </w:t>
+      </w:r>
+      <w:proofErr w:type="spellStart"/>
+      <w:r>
+        <w:rPr>
+          <w:bCs/>
+          <w:color w:val="FF0000"/>
+        </w:rPr>
+        <w:t>Univalue</w:t>
+      </w:r>
+      <w:proofErr w:type="spellEnd"/>
+      <w:r>
+        <w:rPr>
+          <w:bCs/>
+          <w:color w:val="FF0000"/>
+        </w:rPr>
+        <w:t xml:space="preserve"> Path (687)</w:t>
+      </w:r>
+      <w:r>
+        <w:rPr>
+          <w:bCs/>
+          <w:color w:val="FF0000"/>
+        </w:rPr>
+        <w:tab/>
+      </w:r>
+      <w:proofErr w:type="spellStart"/>
+      <w:r>
+        <w:rPr>
+          <w:bCs/>
+          <w:color w:val="FF0000"/>
+        </w:rPr>
+        <w:t>LeetCode</w:t>
+      </w:r>
+      <w:proofErr w:type="spellEnd"/>
+      <w:r>
+        <w:rPr>
+          <w:bCs/>
+          <w:color w:val="FF0000"/>
+        </w:rPr>
+        <w:tab/>
+      </w:r>
+      <w:r>
+        <w:rPr>
+          <w:rFonts w:ascii="Calibri" w:hAnsi="Calibri" w:cs="Calibri"/>
+          <w:bCs/>
+          <w:color w:val="FF0000"/>
+        </w:rPr>
+        <w:t>🟡</w:t>
+      </w:r>
+      <w:r>
+        <w:rPr>
+          <w:bCs/>
+          <w:color w:val="FF0000"/>
+        </w:rPr>
+        <w:t xml:space="preserve"> Medium</w:t>
+      </w:r>
+    </w:p>
+    <w:p>
+      <w:pPr>
+        <w:pStyle w:val="ListParagraph"/>
+        <w:numPr>
+          <w:ilvl w:val="0"/>
+          <w:numId w:val="41"/>
+        </w:numPr>
+        <w:rPr>
+          <w:bCs/>
+          <w:color w:val="FF0000"/>
+        </w:rPr>
+      </w:pPr>
+      <w:r>
+        <w:rPr>
+          <w:bCs/>
+          <w:color w:val="FF0000"/>
+        </w:rPr>
+        <w:t>Maximum Width of Binary Tree (662)</w:t>
+      </w:r>
+      <w:r>
+        <w:rPr>
+          <w:bCs/>
+          <w:color w:val="FF0000"/>
+        </w:rPr>
+        <w:tab/>
+      </w:r>
+      <w:proofErr w:type="spellStart"/>
+      <w:r>
+        <w:rPr>
+          <w:bCs/>
+          <w:color w:val="FF0000"/>
+        </w:rPr>
+        <w:t>LeetCode</w:t>
+      </w:r>
+      <w:proofErr w:type="spellEnd"/>
+      <w:r>
+        <w:rPr>
+          <w:bCs/>
+          <w:color w:val="FF0000"/>
+        </w:rPr>
+        <w:tab/>
+      </w:r>
+      <w:r>
+        <w:rPr>
+          <w:rFonts w:ascii="Calibri" w:hAnsi="Calibri" w:cs="Calibri"/>
+          <w:bCs/>
+          <w:color w:val="FF0000"/>
+        </w:rPr>
+        <w:t>🟡</w:t>
+      </w:r>
+      <w:r>
+        <w:rPr>
+          <w:bCs/>
+          <w:color w:val="FF0000"/>
+        </w:rPr>
+        <w:t xml:space="preserve"> Medium</w:t>
+      </w:r>
+    </w:p>
+    <w:p>
+      <w:pPr>
+        <w:pStyle w:val="ListParagraph"/>
+        <w:numPr>
+          <w:ilvl w:val="0"/>
+          <w:numId w:val="41"/>
+        </w:numPr>
+      </w:pPr>
+      <w:r>
+        <w:rPr>
+          <w:color w:val="FF0000"/>
+        </w:rPr>
+        <w:t xml:space="preserve">Serialize and </w:t>
+      </w:r>
+      <w:proofErr w:type="spellStart"/>
+      <w:r>
+        <w:rPr>
+          <w:color w:val="FF0000"/>
+        </w:rPr>
+        <w:t>Deserialize</w:t>
+      </w:r>
+      <w:proofErr w:type="spellEnd"/>
+      <w:r>
+        <w:rPr>
+          <w:color w:val="FF0000"/>
+        </w:rPr>
+        <w:t xml:space="preserve"> BST (449)</w:t>
+      </w:r>
+      <w:r>
+        <w:rPr>
+          <w:color w:val="FF0000"/>
+        </w:rPr>
+        <w:tab/>
+      </w:r>
+      <w:proofErr w:type="spellStart"/>
+      <w:r>
+        <w:rPr>
+          <w:color w:val="FF0000"/>
+        </w:rPr>
+        <w:t>LeetCode</w:t>
+      </w:r>
+      <w:proofErr w:type="spellEnd"/>
+      <w:r>
+        <w:rPr>
+          <w:color w:val="FF0000"/>
+        </w:rPr>
+        <w:tab/>
+      </w:r>
+      <w:r>
+        <w:rPr>
+          <w:rFonts w:ascii="Calibri" w:hAnsi="Calibri" w:cs="Calibri"/>
+          <w:color w:val="FF0000"/>
+        </w:rPr>
+        <w:t>🟡</w:t>
+      </w:r>
+      <w:r>
+        <w:rPr>
+          <w:color w:val="FF0000"/>
+        </w:rPr>
+        <w:t xml:space="preserve"> Medium</w:t>
+      </w:r>
+      <w:r>
+        <w:rPr>
+          <w:color w:val="FF0000"/>
+        </w:rPr>
+        <w:t xml:space="preserve"> </w:t>
+      </w:r>
+      <w:hyperlink r:id="rId30" w:history="1">
+        <w:r>
+          <w:rPr>
+            <w:rStyle w:val="Hyperlink"/>
+          </w:rPr>
+          <w:t>solution</w:t>
+        </w:r>
+      </w:hyperlink>
+    </w:p>
+    <w:p>
+      <w:pPr>
+        <w:pStyle w:val="ListParagraph"/>
+        <w:numPr>
+          <w:ilvl w:val="0"/>
+          <w:numId w:val="41"/>
+        </w:numPr>
+        <w:rPr>
+          <w:bCs/>
+          <w:color w:val="FF0000"/>
+        </w:rPr>
+      </w:pPr>
+      <w:r>
+        <w:rPr>
+          <w:bCs/>
+          <w:color w:val="FF0000"/>
+        </w:rPr>
+        <w:t>Find Duplicate Subtrees (652)</w:t>
+      </w:r>
+      <w:r>
+        <w:rPr>
+          <w:bCs/>
+          <w:color w:val="FF0000"/>
+        </w:rPr>
+        <w:tab/>
+      </w:r>
+      <w:proofErr w:type="spellStart"/>
+      <w:r>
+        <w:rPr>
+          <w:bCs/>
+          <w:color w:val="FF0000"/>
+        </w:rPr>
+        <w:t>LeetCode</w:t>
+      </w:r>
+      <w:proofErr w:type="spellEnd"/>
+      <w:r>
+        <w:rPr>
+          <w:bCs/>
+          <w:color w:val="FF0000"/>
+        </w:rPr>
+        <w:tab/>
+      </w:r>
+      <w:r>
+        <w:rPr>
+          <w:rFonts w:ascii="Calibri" w:hAnsi="Calibri" w:cs="Calibri"/>
+          <w:bCs/>
+          <w:color w:val="FF0000"/>
+        </w:rPr>
+        <w:t>🟡</w:t>
+      </w:r>
+      <w:r>
+        <w:rPr>
+          <w:bCs/>
+          <w:color w:val="FF0000"/>
+        </w:rPr>
+        <w:t xml:space="preserve"> Medium</w:t>
+      </w:r>
+    </w:p>
+    <w:p>
+      <w:pPr>
+        <w:pStyle w:val="ListParagraph"/>
+        <w:rPr>
+          <w:bCs/>
+          <w:color w:val="FF0000"/>
+        </w:rPr>
+      </w:pPr>
+      <w:bookmarkStart w:id="30" w:name="_GoBack"/>
+      <w:bookmarkEnd w:id="30"/>
+    </w:p>
+    <w:p>
+      <w:pPr>
+        <w:pStyle w:val="ListParagraph"/>
+        <w:numPr>
+          <w:ilvl w:val="0"/>
+          <w:numId w:val="41"/>
+        </w:numPr>
+      </w:pPr>
+      <w:r>
+        <w:t>Lowest Common Ancestor of a BST (235)</w:t>
+      </w:r>
+      <w:r>
+        <w:tab/>
+      </w:r>
+      <w:proofErr w:type="spellStart"/>
+      <w:r>
+        <w:t>LeetCode</w:t>
+      </w:r>
+      <w:proofErr w:type="spellEnd"/>
+      <w:r>
+        <w:tab/>
+      </w:r>
+      <w:r>
+        <w:rPr>
+          <w:rFonts w:ascii="Calibri" w:hAnsi="Calibri" w:cs="Calibri"/>
+        </w:rPr>
+        <w:t>🟡</w:t>
+      </w:r>
+      <w:r>
+        <w:t xml:space="preserve"> Medium</w:t>
+      </w:r>
+    </w:p>
+    <w:p>
+      <w:pPr>
+        <w:pStyle w:val="ListParagraph"/>
+        <w:numPr>
+          <w:ilvl w:val="0"/>
+          <w:numId w:val="41"/>
+        </w:numPr>
+      </w:pPr>
+      <w:r>
+        <w:t>Lowest Common Ancestor of a Binary Tree (236)</w:t>
+      </w:r>
+      <w:r>
+        <w:tab/>
+      </w:r>
+      <w:proofErr w:type="spellStart"/>
+      <w:r>
+        <w:t>LeetCode</w:t>
+      </w:r>
+      <w:proofErr w:type="spellEnd"/>
+      <w:r>
+        <w:tab/>
+      </w:r>
+      <w:r>
+        <w:rPr>
+          <w:rFonts w:ascii="Calibri" w:hAnsi="Calibri" w:cs="Calibri"/>
+        </w:rPr>
+        <w:t>🟡</w:t>
+      </w:r>
+      <w:r>
+        <w:t xml:space="preserve"> Medium</w:t>
+      </w:r>
+    </w:p>
+    <w:p>
+      <w:pPr>
+        <w:pStyle w:val="ListParagraph"/>
+        <w:numPr>
+          <w:ilvl w:val="0"/>
+          <w:numId w:val="41"/>
+        </w:numPr>
+      </w:pPr>
+      <w:r>
+        <w:t>Step-By-Step Directions From a Binary Tree Node to Another (2096)</w:t>
+      </w:r>
+      <w:r>
+        <w:tab/>
+      </w:r>
+      <w:proofErr w:type="spellStart"/>
+      <w:r>
+        <w:t>LeetCode</w:t>
+      </w:r>
+      <w:proofErr w:type="spellEnd"/>
+      <w:r>
+        <w:tab/>
+      </w:r>
+      <w:r>
+        <w:rPr>
+          <w:rFonts w:ascii="Calibri" w:hAnsi="Calibri" w:cs="Calibri"/>
+        </w:rPr>
+        <w:t>🟡</w:t>
+      </w:r>
+      <w:r>
+        <w:t xml:space="preserve"> Medium</w:t>
+      </w:r>
+    </w:p>
+    <w:p/>
+    <w:p>
+      <w:pPr>
+        <w:pStyle w:val="Heading2"/>
+        <w:rPr>
+          <w:b/>
+        </w:rPr>
+      </w:pPr>
+      <w:r>
+        <w:rPr>
+          <w:b/>
+          <w:sz w:val="28"/>
+        </w:rPr>
+        <w:t>Pattern 5</w:t>
+      </w:r>
+      <w:r>
+        <w:rPr>
+          <w:b/>
+          <w:sz w:val="28"/>
+        </w:rPr>
+        <w:t>—</w:t>
+      </w:r>
+      <w:r>
+        <w:rPr>
+          <w:b/>
+          <w:sz w:val="28"/>
+        </w:rPr>
+        <w:t xml:space="preserve"> Tree Construction and modification</w:t>
+      </w:r>
+    </w:p>
+    <w:p>
+      <w:pPr>
+        <w:pStyle w:val="ListParagraph"/>
+        <w:numPr>
+          <w:ilvl w:val="0"/>
+          <w:numId w:val="40"/>
+        </w:numPr>
+      </w:pPr>
+      <w:r>
+        <w:t xml:space="preserve">Construct Binary Tree from </w:t>
+      </w:r>
+      <w:proofErr w:type="spellStart"/>
+      <w:r>
+        <w:t>Preorder</w:t>
+      </w:r>
+      <w:proofErr w:type="spellEnd"/>
+      <w:r>
+        <w:t xml:space="preserve"> and </w:t>
+      </w:r>
+      <w:proofErr w:type="spellStart"/>
+      <w:r>
+        <w:t>Inorder</w:t>
+      </w:r>
+      <w:proofErr w:type="spellEnd"/>
+      <w:r>
+        <w:t xml:space="preserve"> Traversal (105)</w:t>
+      </w:r>
+      <w:r>
+        <w:tab/>
+      </w:r>
+      <w:proofErr w:type="spellStart"/>
+      <w:r>
+        <w:t>LeetCode</w:t>
+      </w:r>
+      <w:proofErr w:type="spellEnd"/>
+      <w:r>
+        <w:tab/>
+      </w:r>
+      <w:r>
+        <w:rPr>
+          <w:rFonts w:ascii="Calibri" w:hAnsi="Calibri" w:cs="Calibri"/>
+        </w:rPr>
+        <w:t>🟡</w:t>
+      </w:r>
+      <w:r>
+        <w:t xml:space="preserve"> Medium</w:t>
+      </w:r>
+    </w:p>
+    <w:p>
+      <w:pPr>
+        <w:pStyle w:val="ListParagraph"/>
+        <w:numPr>
+          <w:ilvl w:val="0"/>
+          <w:numId w:val="40"/>
+        </w:numPr>
+      </w:pPr>
+      <w:r>
+        <w:t xml:space="preserve">Construct Binary Tree from </w:t>
+      </w:r>
+      <w:proofErr w:type="spellStart"/>
+      <w:r>
+        <w:t>Inorder</w:t>
+      </w:r>
+      <w:proofErr w:type="spellEnd"/>
+      <w:r>
+        <w:t xml:space="preserve"> and </w:t>
+      </w:r>
+      <w:proofErr w:type="spellStart"/>
+      <w:r>
+        <w:t>Postorder</w:t>
+      </w:r>
+      <w:proofErr w:type="spellEnd"/>
+      <w:r>
+        <w:t xml:space="preserve"> Traversal (106)</w:t>
+      </w:r>
+      <w:r>
+        <w:tab/>
+      </w:r>
+      <w:proofErr w:type="spellStart"/>
+      <w:r>
+        <w:t>LeetCode</w:t>
+      </w:r>
+      <w:proofErr w:type="spellEnd"/>
+      <w:r>
+        <w:tab/>
+      </w:r>
+      <w:r>
+        <w:rPr>
+          <w:rFonts w:ascii="Calibri" w:hAnsi="Calibri" w:cs="Calibri"/>
+        </w:rPr>
+        <w:t>🟡</w:t>
+      </w:r>
+      <w:r>
+        <w:t xml:space="preserve"> Medium</w:t>
+      </w:r>
+    </w:p>
+    <w:p>
+      <w:pPr>
+        <w:pStyle w:val="ListParagraph"/>
+        <w:numPr>
+          <w:ilvl w:val="0"/>
+          <w:numId w:val="40"/>
+        </w:numPr>
+      </w:pPr>
+      <w:r>
+        <w:t>Convert Sorted Array to BST (108)</w:t>
+      </w:r>
+      <w:r>
+        <w:tab/>
+      </w:r>
+      <w:proofErr w:type="spellStart"/>
+      <w:r>
+        <w:t>LeetCode</w:t>
+      </w:r>
+      <w:proofErr w:type="spellEnd"/>
+      <w:r>
+        <w:tab/>
+      </w:r>
+      <w:r>
+        <w:rPr>
+          <w:rFonts w:ascii="Calibri" w:hAnsi="Calibri" w:cs="Calibri"/>
+        </w:rPr>
+        <w:t>🟢</w:t>
+      </w:r>
+      <w:r>
+        <w:t xml:space="preserve"> Easy</w:t>
+      </w:r>
+    </w:p>
+    <w:p>
+      <w:pPr>
+        <w:pStyle w:val="ListParagraph"/>
+        <w:numPr>
+          <w:ilvl w:val="0"/>
+          <w:numId w:val="40"/>
+        </w:numPr>
+      </w:pPr>
+      <w:r>
+        <w:t>Convert Sorted List to BST (109)</w:t>
+      </w:r>
+      <w:r>
+        <w:tab/>
+      </w:r>
+      <w:proofErr w:type="spellStart"/>
+      <w:r>
+        <w:t>LeetCode</w:t>
+      </w:r>
+      <w:proofErr w:type="spellEnd"/>
+      <w:r>
+        <w:tab/>
+      </w:r>
+      <w:r>
+        <w:rPr>
+          <w:rFonts w:ascii="Calibri" w:hAnsi="Calibri" w:cs="Calibri"/>
+        </w:rPr>
+        <w:t>🟡</w:t>
+      </w:r>
+      <w:r>
+        <w:t xml:space="preserve"> Medium</w:t>
+      </w:r>
+    </w:p>
+    <w:p>
+      <w:pPr>
+        <w:pStyle w:val="ListParagraph"/>
+        <w:numPr>
+          <w:ilvl w:val="0"/>
+          <w:numId w:val="40"/>
+        </w:numPr>
+      </w:pPr>
+      <w:r>
+        <w:t xml:space="preserve">Construct Binary Tree from </w:t>
+      </w:r>
+      <w:proofErr w:type="spellStart"/>
+      <w:r>
+        <w:t>Preorder</w:t>
+      </w:r>
+      <w:proofErr w:type="spellEnd"/>
+      <w:r>
+        <w:t xml:space="preserve"> &amp; </w:t>
+      </w:r>
+      <w:proofErr w:type="spellStart"/>
+      <w:r>
+        <w:t>Postorder</w:t>
+      </w:r>
+      <w:proofErr w:type="spellEnd"/>
+      <w:r>
+        <w:t xml:space="preserve"> (889)</w:t>
+      </w:r>
+      <w:r>
+        <w:tab/>
+      </w:r>
+      <w:proofErr w:type="spellStart"/>
+      <w:r>
+        <w:t>LeetCode</w:t>
+      </w:r>
+      <w:proofErr w:type="spellEnd"/>
+      <w:r>
+        <w:tab/>
+      </w:r>
+      <w:r>
+        <w:rPr>
+          <w:rFonts w:ascii="Calibri" w:hAnsi="Calibri" w:cs="Calibri"/>
+        </w:rPr>
+        <w:t>🟡</w:t>
+      </w:r>
+      <w:r>
+        <w:t xml:space="preserve"> Medium</w:t>
+      </w:r>
+    </w:p>
+    <w:p>
+      <w:pPr>
+        <w:pStyle w:val="ListParagraph"/>
+        <w:numPr>
+          <w:ilvl w:val="0"/>
+          <w:numId w:val="40"/>
+        </w:numPr>
+      </w:pPr>
+      <w:r>
+        <w:t xml:space="preserve">Recover a Tree From </w:t>
+      </w:r>
+      <w:proofErr w:type="spellStart"/>
+      <w:r>
+        <w:t>Preorder</w:t>
+      </w:r>
+      <w:proofErr w:type="spellEnd"/>
+      <w:r>
+        <w:t xml:space="preserve"> Traversal (1028)</w:t>
+      </w:r>
+      <w:r>
+        <w:tab/>
+      </w:r>
+      <w:proofErr w:type="spellStart"/>
+      <w:r>
+        <w:t>LeetCode</w:t>
+      </w:r>
+      <w:proofErr w:type="spellEnd"/>
+      <w:r>
+        <w:tab/>
+      </w:r>
+      <w:r>
+        <w:rPr>
+          <w:rFonts w:ascii="Segoe UI Symbol" w:hAnsi="Segoe UI Symbol" w:cs="Segoe UI Symbol"/>
+        </w:rPr>
+        <w:t>🔴</w:t>
+      </w:r>
+      <w:r>
+        <w:t xml:space="preserve"> Hard</w:t>
+      </w:r>
+    </w:p>
+    <w:p>
+      <w:pPr>
+        <w:pStyle w:val="ListParagraph"/>
+        <w:numPr>
+          <w:ilvl w:val="0"/>
+          <w:numId w:val="40"/>
+        </w:numPr>
+      </w:pPr>
+      <w:r>
+        <w:t>Convert Binary Tree to Doubly Linked List</w:t>
+      </w:r>
+      <w:r>
+        <w:tab/>
+      </w:r>
+      <w:proofErr w:type="spellStart"/>
+      <w:r>
+        <w:t>GeeksforGeeks</w:t>
+      </w:r>
+      <w:proofErr w:type="spellEnd"/>
+      <w:r>
+        <w:tab/>
+      </w:r>
+      <w:r>
+        <w:rPr>
+          <w:rFonts w:ascii="Calibri" w:hAnsi="Calibri" w:cs="Calibri"/>
+        </w:rPr>
+        <w:t>🟡</w:t>
+      </w:r>
+    </w:p>
+    <w:p>
+      <w:pPr>
+        <w:pStyle w:val="ListParagraph"/>
+        <w:numPr>
+          <w:ilvl w:val="0"/>
+          <w:numId w:val="40"/>
+        </w:numPr>
+      </w:pPr>
+      <w:r>
+        <w:t>Flatten Binary Tree to Linked List (114)</w:t>
+      </w:r>
+      <w:r>
+        <w:tab/>
+      </w:r>
+      <w:proofErr w:type="spellStart"/>
+      <w:r>
+        <w:t>LeetCode</w:t>
+      </w:r>
+      <w:proofErr w:type="spellEnd"/>
+      <w:r>
+        <w:tab/>
+      </w:r>
+      <w:r>
+        <w:rPr>
+          <w:rFonts w:ascii="Calibri" w:hAnsi="Calibri" w:cs="Calibri"/>
+        </w:rPr>
+        <w:t>🟡</w:t>
+      </w:r>
+      <w:r>
+        <w:t xml:space="preserve"> Medium</w:t>
+      </w:r>
+    </w:p>
+    <w:p>
+      <w:pPr>
+        <w:pStyle w:val="ListParagraph"/>
+        <w:numPr>
+          <w:ilvl w:val="0"/>
+          <w:numId w:val="40"/>
+        </w:numPr>
+      </w:pPr>
+      <w:r>
+        <w:t>Populating Next Right Pointers in Each Node (116)</w:t>
+      </w:r>
+      <w:r>
+        <w:tab/>
+      </w:r>
+      <w:proofErr w:type="spellStart"/>
+      <w:r>
+        <w:t>LeetCode</w:t>
+      </w:r>
+      <w:proofErr w:type="spellEnd"/>
+      <w:r>
+        <w:tab/>
+      </w:r>
+      <w:r>
+        <w:rPr>
+          <w:rFonts w:ascii="Calibri" w:hAnsi="Calibri" w:cs="Calibri"/>
+        </w:rPr>
+        <w:t>🟡</w:t>
+      </w:r>
+      <w:r>
+        <w:t xml:space="preserve"> Medium</w:t>
+      </w:r>
+    </w:p>
+    <w:p>
+      <w:pPr>
+        <w:pStyle w:val="ListParagraph"/>
+        <w:numPr>
+          <w:ilvl w:val="0"/>
+          <w:numId w:val="40"/>
+        </w:numPr>
+      </w:pPr>
+      <w:r>
+        <w:t>Populating Next Right Pointers II (117)</w:t>
+      </w:r>
+      <w:r>
+        <w:tab/>
+      </w:r>
+      <w:proofErr w:type="spellStart"/>
+      <w:r>
+        <w:t>LeetCode</w:t>
+      </w:r>
+      <w:proofErr w:type="spellEnd"/>
+      <w:r>
+        <w:tab/>
+      </w:r>
+      <w:r>
+        <w:rPr>
+          <w:rFonts w:ascii="Calibri" w:hAnsi="Calibri" w:cs="Calibri"/>
+        </w:rPr>
+        <w:t>🟡</w:t>
+      </w:r>
+      <w:r>
+        <w:t xml:space="preserve"> Medium</w:t>
+      </w:r>
+    </w:p>
+    <w:p>
+      <w:pPr>
+        <w:pStyle w:val="ListParagraph"/>
+      </w:pPr>
+      <w:r>
+        <w:tab/>
+      </w:r>
+      <w:r>
+        <w:tab/>
+      </w:r>
+    </w:p>
+    <w:p>
+      <w:pPr>
+        <w:pStyle w:val="Heading2"/>
+        <w:rPr>
+          <w:b/>
+        </w:rPr>
+      </w:pPr>
+      <w:r>
+        <w:rPr>
+          <w:b/>
+          <w:sz w:val="28"/>
+        </w:rPr>
+        <w:t>Pattern 6</w:t>
+      </w:r>
+      <w:r>
+        <w:rPr>
+          <w:b/>
+          <w:sz w:val="28"/>
+        </w:rPr>
+        <w:t xml:space="preserve"> —</w:t>
+      </w:r>
+      <w:r>
+        <w:rPr>
+          <w:b/>
+          <w:sz w:val="28"/>
+        </w:rPr>
         <w:t xml:space="preserve"> Tree Views</w:t>
       </w:r>
     </w:p>
@@ -11573,996 +12497,6 @@
         <w:t xml:space="preserve"> Medium</w:t>
       </w:r>
     </w:p>
-    <w:p/>
-    <w:p>
-      <w:pPr>
-        <w:pStyle w:val="Heading2"/>
-        <w:rPr>
-          <w:b/>
-        </w:rPr>
-      </w:pPr>
-      <w:r>
-        <w:rPr>
-          <w:b/>
-          <w:sz w:val="28"/>
-        </w:rPr>
-        <w:t>Pattern 5</w:t>
-      </w:r>
-      <w:r>
-        <w:rPr>
-          <w:b/>
-          <w:sz w:val="28"/>
-        </w:rPr>
-        <w:t xml:space="preserve"> —</w:t>
-      </w:r>
-      <w:r>
-        <w:rPr>
-          <w:b/>
-          <w:sz w:val="28"/>
-        </w:rPr>
-        <w:t xml:space="preserve"> Advanced DFs</w:t>
-      </w:r>
-    </w:p>
-    <w:p>
-      <w:pPr>
-        <w:pStyle w:val="ListParagraph"/>
-        <w:numPr>
-          <w:ilvl w:val="0"/>
-          <w:numId w:val="41"/>
-        </w:numPr>
-        <w:rPr>
-          <w:bCs/>
-        </w:rPr>
-      </w:pPr>
-      <w:r>
-        <w:rPr>
-          <w:bCs/>
-        </w:rPr>
-        <w:t>Diameter of Binary Tree (543)</w:t>
-      </w:r>
-      <w:r>
-        <w:rPr>
-          <w:bCs/>
-        </w:rPr>
-        <w:tab/>
-      </w:r>
-      <w:proofErr w:type="spellStart"/>
-      <w:r>
-        <w:rPr>
-          <w:bCs/>
-        </w:rPr>
-        <w:t>LeetCode</w:t>
-      </w:r>
-      <w:proofErr w:type="spellEnd"/>
-      <w:r>
-        <w:rPr>
-          <w:bCs/>
-        </w:rPr>
-        <w:tab/>
-      </w:r>
-      <w:r>
-        <w:rPr>
-          <w:rFonts w:ascii="Calibri" w:hAnsi="Calibri" w:cs="Calibri"/>
-          <w:bCs/>
-        </w:rPr>
-        <w:t>🟢</w:t>
-      </w:r>
-      <w:r>
-        <w:rPr>
-          <w:bCs/>
-        </w:rPr>
-        <w:t xml:space="preserve"> Easy</w:t>
-      </w:r>
-    </w:p>
-    <w:p>
-      <w:pPr>
-        <w:pStyle w:val="ListParagraph"/>
-        <w:numPr>
-          <w:ilvl w:val="0"/>
-          <w:numId w:val="41"/>
-        </w:numPr>
-        <w:rPr>
-          <w:bCs/>
-        </w:rPr>
-      </w:pPr>
-      <w:r>
-        <w:rPr>
-          <w:bCs/>
-        </w:rPr>
-        <w:t>Count Good Nodes in Binary Tree (1448)</w:t>
-      </w:r>
-      <w:r>
-        <w:rPr>
-          <w:bCs/>
-        </w:rPr>
-        <w:tab/>
-      </w:r>
-      <w:proofErr w:type="spellStart"/>
-      <w:r>
-        <w:rPr>
-          <w:bCs/>
-        </w:rPr>
-        <w:t>LeetCode</w:t>
-      </w:r>
-      <w:proofErr w:type="spellEnd"/>
-      <w:r>
-        <w:rPr>
-          <w:bCs/>
-        </w:rPr>
-        <w:tab/>
-      </w:r>
-      <w:r>
-        <w:rPr>
-          <w:rFonts w:ascii="Calibri" w:hAnsi="Calibri" w:cs="Calibri"/>
-          <w:bCs/>
-        </w:rPr>
-        <w:t>🟡</w:t>
-      </w:r>
-      <w:r>
-        <w:rPr>
-          <w:bCs/>
-        </w:rPr>
-        <w:t xml:space="preserve"> Medium</w:t>
-      </w:r>
-    </w:p>
-    <w:p>
-      <w:pPr>
-        <w:pStyle w:val="ListParagraph"/>
-        <w:numPr>
-          <w:ilvl w:val="0"/>
-          <w:numId w:val="41"/>
-        </w:numPr>
-        <w:rPr>
-          <w:bCs/>
-        </w:rPr>
-      </w:pPr>
-      <w:r>
-        <w:rPr>
-          <w:bCs/>
-        </w:rPr>
-        <w:t xml:space="preserve">Longest </w:t>
-      </w:r>
-      <w:proofErr w:type="spellStart"/>
-      <w:r>
-        <w:rPr>
-          <w:bCs/>
-        </w:rPr>
-        <w:t>Univalue</w:t>
-      </w:r>
-      <w:proofErr w:type="spellEnd"/>
-      <w:r>
-        <w:rPr>
-          <w:bCs/>
-        </w:rPr>
-        <w:t xml:space="preserve"> Path (687)</w:t>
-      </w:r>
-      <w:r>
-        <w:rPr>
-          <w:bCs/>
-        </w:rPr>
-        <w:tab/>
-      </w:r>
-      <w:proofErr w:type="spellStart"/>
-      <w:r>
-        <w:rPr>
-          <w:bCs/>
-        </w:rPr>
-        <w:t>LeetCode</w:t>
-      </w:r>
-      <w:proofErr w:type="spellEnd"/>
-      <w:r>
-        <w:rPr>
-          <w:bCs/>
-        </w:rPr>
-        <w:tab/>
-      </w:r>
-      <w:r>
-        <w:rPr>
-          <w:rFonts w:ascii="Calibri" w:hAnsi="Calibri" w:cs="Calibri"/>
-          <w:bCs/>
-        </w:rPr>
-        <w:t>🟡</w:t>
-      </w:r>
-      <w:r>
-        <w:rPr>
-          <w:bCs/>
-        </w:rPr>
-        <w:t xml:space="preserve"> Medium</w:t>
-      </w:r>
-    </w:p>
-    <w:p>
-      <w:pPr>
-        <w:pStyle w:val="ListParagraph"/>
-        <w:numPr>
-          <w:ilvl w:val="0"/>
-          <w:numId w:val="41"/>
-        </w:numPr>
-        <w:rPr>
-          <w:bCs/>
-        </w:rPr>
-      </w:pPr>
-      <w:r>
-        <w:rPr>
-          <w:bCs/>
-        </w:rPr>
-        <w:t>All Nodes Distance K in Binary Tree (863)</w:t>
-      </w:r>
-      <w:r>
-        <w:rPr>
-          <w:bCs/>
-        </w:rPr>
-        <w:tab/>
-      </w:r>
-      <w:proofErr w:type="spellStart"/>
-      <w:r>
-        <w:rPr>
-          <w:bCs/>
-        </w:rPr>
-        <w:t>LeetCode</w:t>
-      </w:r>
-      <w:proofErr w:type="spellEnd"/>
-      <w:r>
-        <w:rPr>
-          <w:bCs/>
-        </w:rPr>
-        <w:tab/>
-      </w:r>
-      <w:r>
-        <w:rPr>
-          <w:rFonts w:ascii="Calibri" w:hAnsi="Calibri" w:cs="Calibri"/>
-          <w:bCs/>
-        </w:rPr>
-        <w:t>🟡</w:t>
-      </w:r>
-      <w:r>
-        <w:rPr>
-          <w:bCs/>
-        </w:rPr>
-        <w:t xml:space="preserve"> Medium</w:t>
-      </w:r>
-    </w:p>
-    <w:p>
-      <w:pPr>
-        <w:pStyle w:val="ListParagraph"/>
-        <w:numPr>
-          <w:ilvl w:val="0"/>
-          <w:numId w:val="41"/>
-        </w:numPr>
-        <w:rPr>
-          <w:bCs/>
-        </w:rPr>
-      </w:pPr>
-      <w:r>
-        <w:rPr>
-          <w:bCs/>
-        </w:rPr>
-        <w:t>Count Complete Tree Nodes (222)</w:t>
-      </w:r>
-      <w:r>
-        <w:rPr>
-          <w:bCs/>
-        </w:rPr>
-        <w:tab/>
-      </w:r>
-      <w:proofErr w:type="spellStart"/>
-      <w:r>
-        <w:rPr>
-          <w:bCs/>
-        </w:rPr>
-        <w:t>LeetCode</w:t>
-      </w:r>
-      <w:proofErr w:type="spellEnd"/>
-      <w:r>
-        <w:rPr>
-          <w:bCs/>
-        </w:rPr>
-        <w:tab/>
-      </w:r>
-      <w:r>
-        <w:rPr>
-          <w:rFonts w:ascii="Calibri" w:hAnsi="Calibri" w:cs="Calibri"/>
-          <w:bCs/>
-        </w:rPr>
-        <w:t>🟡</w:t>
-      </w:r>
-      <w:r>
-        <w:rPr>
-          <w:bCs/>
-        </w:rPr>
-        <w:t xml:space="preserve"> Medium</w:t>
-      </w:r>
-    </w:p>
-    <w:p>
-      <w:pPr>
-        <w:pStyle w:val="ListParagraph"/>
-        <w:numPr>
-          <w:ilvl w:val="0"/>
-          <w:numId w:val="41"/>
-        </w:numPr>
-        <w:rPr>
-          <w:bCs/>
-        </w:rPr>
-      </w:pPr>
-      <w:r>
-        <w:rPr>
-          <w:bCs/>
-        </w:rPr>
-        <w:t>Maximum Width of Binary Tree (662)</w:t>
-      </w:r>
-      <w:r>
-        <w:rPr>
-          <w:bCs/>
-        </w:rPr>
-        <w:tab/>
-      </w:r>
-      <w:proofErr w:type="spellStart"/>
-      <w:r>
-        <w:rPr>
-          <w:bCs/>
-        </w:rPr>
-        <w:t>LeetCode</w:t>
-      </w:r>
-      <w:proofErr w:type="spellEnd"/>
-      <w:r>
-        <w:rPr>
-          <w:bCs/>
-        </w:rPr>
-        <w:tab/>
-      </w:r>
-      <w:r>
-        <w:rPr>
-          <w:rFonts w:ascii="Calibri" w:hAnsi="Calibri" w:cs="Calibri"/>
-          <w:bCs/>
-        </w:rPr>
-        <w:t>🟡</w:t>
-      </w:r>
-      <w:r>
-        <w:rPr>
-          <w:bCs/>
-        </w:rPr>
-        <w:t xml:space="preserve"> Medium</w:t>
-      </w:r>
-    </w:p>
-    <w:p>
-      <w:pPr>
-        <w:pStyle w:val="ListParagraph"/>
-        <w:numPr>
-          <w:ilvl w:val="0"/>
-          <w:numId w:val="41"/>
-        </w:numPr>
-        <w:rPr>
-          <w:bCs/>
-        </w:rPr>
-      </w:pPr>
-      <w:r>
-        <w:rPr>
-          <w:bCs/>
-        </w:rPr>
-        <w:t>Find Duplicate Subtrees (652)</w:t>
-      </w:r>
-      <w:r>
-        <w:rPr>
-          <w:bCs/>
-        </w:rPr>
-        <w:tab/>
-      </w:r>
-      <w:proofErr w:type="spellStart"/>
-      <w:r>
-        <w:rPr>
-          <w:bCs/>
-        </w:rPr>
-        <w:t>LeetCode</w:t>
-      </w:r>
-      <w:proofErr w:type="spellEnd"/>
-      <w:r>
-        <w:rPr>
-          <w:bCs/>
-        </w:rPr>
-        <w:tab/>
-      </w:r>
-      <w:r>
-        <w:rPr>
-          <w:rFonts w:ascii="Calibri" w:hAnsi="Calibri" w:cs="Calibri"/>
-          <w:bCs/>
-        </w:rPr>
-        <w:t>🟡</w:t>
-      </w:r>
-      <w:r>
-        <w:rPr>
-          <w:bCs/>
-        </w:rPr>
-        <w:t xml:space="preserve"> Medium</w:t>
-      </w:r>
-    </w:p>
-    <w:p>
-      <w:pPr>
-        <w:pStyle w:val="ListParagraph"/>
-        <w:numPr>
-          <w:ilvl w:val="0"/>
-          <w:numId w:val="41"/>
-        </w:numPr>
-      </w:pPr>
-      <w:r>
-        <w:t>Lowest Common Ancestor of a BST (235)</w:t>
-      </w:r>
-      <w:r>
-        <w:tab/>
-      </w:r>
-      <w:proofErr w:type="spellStart"/>
-      <w:r>
-        <w:t>LeetCode</w:t>
-      </w:r>
-      <w:proofErr w:type="spellEnd"/>
-      <w:r>
-        <w:tab/>
-      </w:r>
-      <w:r>
-        <w:rPr>
-          <w:rFonts w:ascii="Calibri" w:hAnsi="Calibri" w:cs="Calibri"/>
-        </w:rPr>
-        <w:t>🟡</w:t>
-      </w:r>
-      <w:r>
-        <w:t xml:space="preserve"> Medium</w:t>
-      </w:r>
-    </w:p>
-    <w:p>
-      <w:pPr>
-        <w:pStyle w:val="ListParagraph"/>
-        <w:numPr>
-          <w:ilvl w:val="0"/>
-          <w:numId w:val="41"/>
-        </w:numPr>
-      </w:pPr>
-      <w:r>
-        <w:t>Lowest Common Ancestor of a Binary Tree (236)</w:t>
-      </w:r>
-      <w:r>
-        <w:tab/>
-      </w:r>
-      <w:proofErr w:type="spellStart"/>
-      <w:r>
-        <w:t>LeetCode</w:t>
-      </w:r>
-      <w:proofErr w:type="spellEnd"/>
-      <w:r>
-        <w:tab/>
-      </w:r>
-      <w:r>
-        <w:rPr>
-          <w:rFonts w:ascii="Calibri" w:hAnsi="Calibri" w:cs="Calibri"/>
-        </w:rPr>
-        <w:t>🟡</w:t>
-      </w:r>
-      <w:r>
-        <w:t xml:space="preserve"> Medium</w:t>
-      </w:r>
-    </w:p>
-    <w:p>
-      <w:pPr>
-        <w:pStyle w:val="ListParagraph"/>
-        <w:numPr>
-          <w:ilvl w:val="0"/>
-          <w:numId w:val="41"/>
-        </w:numPr>
-      </w:pPr>
-      <w:r>
-        <w:t>Step-By-Step Directions From a Binary Tree Node to Another (2096)</w:t>
-      </w:r>
-      <w:r>
-        <w:tab/>
-      </w:r>
-      <w:proofErr w:type="spellStart"/>
-      <w:r>
-        <w:t>LeetCode</w:t>
-      </w:r>
-      <w:proofErr w:type="spellEnd"/>
-      <w:r>
-        <w:tab/>
-      </w:r>
-      <w:r>
-        <w:rPr>
-          <w:rFonts w:ascii="Calibri" w:hAnsi="Calibri" w:cs="Calibri"/>
-        </w:rPr>
-        <w:t>🟡</w:t>
-      </w:r>
-      <w:r>
-        <w:t xml:space="preserve"> Medium</w:t>
-      </w:r>
-    </w:p>
-    <w:p>
-      <w:bookmarkStart w:id="30" w:name="_GoBack"/>
-      <w:bookmarkEnd w:id="30"/>
-    </w:p>
-    <w:p>
-      <w:pPr>
-        <w:pStyle w:val="Heading2"/>
-        <w:rPr>
-          <w:b/>
-        </w:rPr>
-      </w:pPr>
-      <w:r>
-        <w:rPr>
-          <w:b/>
-          <w:sz w:val="28"/>
-        </w:rPr>
-        <w:t xml:space="preserve">Pattern 6 </w:t>
-      </w:r>
-      <w:r>
-        <w:rPr>
-          <w:b/>
-          <w:sz w:val="28"/>
-        </w:rPr>
-        <w:t>—</w:t>
-      </w:r>
-      <w:r>
-        <w:rPr>
-          <w:b/>
-          <w:sz w:val="28"/>
-        </w:rPr>
-        <w:t xml:space="preserve"> Tree Construction and modification</w:t>
-      </w:r>
-    </w:p>
-    <w:p>
-      <w:pPr>
-        <w:pStyle w:val="ListParagraph"/>
-        <w:numPr>
-          <w:ilvl w:val="0"/>
-          <w:numId w:val="40"/>
-        </w:numPr>
-      </w:pPr>
-      <w:r>
-        <w:t xml:space="preserve">Construct Binary Tree from </w:t>
-      </w:r>
-      <w:proofErr w:type="spellStart"/>
-      <w:r>
-        <w:t>Preorder</w:t>
-      </w:r>
-      <w:proofErr w:type="spellEnd"/>
-      <w:r>
-        <w:t xml:space="preserve"> and </w:t>
-      </w:r>
-      <w:proofErr w:type="spellStart"/>
-      <w:r>
-        <w:t>Inorder</w:t>
-      </w:r>
-      <w:proofErr w:type="spellEnd"/>
-      <w:r>
-        <w:t xml:space="preserve"> Traversal (105)</w:t>
-      </w:r>
-      <w:r>
-        <w:tab/>
-      </w:r>
-      <w:proofErr w:type="spellStart"/>
-      <w:r>
-        <w:t>LeetCode</w:t>
-      </w:r>
-      <w:proofErr w:type="spellEnd"/>
-      <w:r>
-        <w:tab/>
-      </w:r>
-      <w:r>
-        <w:rPr>
-          <w:rFonts w:ascii="Calibri" w:hAnsi="Calibri" w:cs="Calibri"/>
-        </w:rPr>
-        <w:t>🟡</w:t>
-      </w:r>
-      <w:r>
-        <w:t xml:space="preserve"> Medium</w:t>
-      </w:r>
-    </w:p>
-    <w:p>
-      <w:pPr>
-        <w:pStyle w:val="ListParagraph"/>
-        <w:numPr>
-          <w:ilvl w:val="0"/>
-          <w:numId w:val="40"/>
-        </w:numPr>
-      </w:pPr>
-      <w:r>
-        <w:t xml:space="preserve">Construct Binary Tree from </w:t>
-      </w:r>
-      <w:proofErr w:type="spellStart"/>
-      <w:r>
-        <w:t>Inorder</w:t>
-      </w:r>
-      <w:proofErr w:type="spellEnd"/>
-      <w:r>
-        <w:t xml:space="preserve"> and </w:t>
-      </w:r>
-      <w:proofErr w:type="spellStart"/>
-      <w:r>
-        <w:t>Postorder</w:t>
-      </w:r>
-      <w:proofErr w:type="spellEnd"/>
-      <w:r>
-        <w:t xml:space="preserve"> Traversal (106)</w:t>
-      </w:r>
-      <w:r>
-        <w:tab/>
-      </w:r>
-      <w:proofErr w:type="spellStart"/>
-      <w:r>
-        <w:t>LeetCode</w:t>
-      </w:r>
-      <w:proofErr w:type="spellEnd"/>
-      <w:r>
-        <w:tab/>
-      </w:r>
-      <w:r>
-        <w:rPr>
-          <w:rFonts w:ascii="Calibri" w:hAnsi="Calibri" w:cs="Calibri"/>
-        </w:rPr>
-        <w:t>🟡</w:t>
-      </w:r>
-      <w:r>
-        <w:t xml:space="preserve"> Medium</w:t>
-      </w:r>
-    </w:p>
-    <w:p>
-      <w:pPr>
-        <w:pStyle w:val="ListParagraph"/>
-        <w:numPr>
-          <w:ilvl w:val="0"/>
-          <w:numId w:val="40"/>
-        </w:numPr>
-      </w:pPr>
-      <w:r>
-        <w:t>Convert Sorted Array to BST (108)</w:t>
-      </w:r>
-      <w:r>
-        <w:tab/>
-      </w:r>
-      <w:proofErr w:type="spellStart"/>
-      <w:r>
-        <w:t>LeetCode</w:t>
-      </w:r>
-      <w:proofErr w:type="spellEnd"/>
-      <w:r>
-        <w:tab/>
-      </w:r>
-      <w:r>
-        <w:rPr>
-          <w:rFonts w:ascii="Calibri" w:hAnsi="Calibri" w:cs="Calibri"/>
-        </w:rPr>
-        <w:t>🟢</w:t>
-      </w:r>
-      <w:r>
-        <w:t xml:space="preserve"> Easy</w:t>
-      </w:r>
-    </w:p>
-    <w:p>
-      <w:pPr>
-        <w:pStyle w:val="ListParagraph"/>
-        <w:numPr>
-          <w:ilvl w:val="0"/>
-          <w:numId w:val="40"/>
-        </w:numPr>
-      </w:pPr>
-      <w:r>
-        <w:t>Convert Sorted List to BST (109)</w:t>
-      </w:r>
-      <w:r>
-        <w:tab/>
-      </w:r>
-      <w:proofErr w:type="spellStart"/>
-      <w:r>
-        <w:t>LeetCode</w:t>
-      </w:r>
-      <w:proofErr w:type="spellEnd"/>
-      <w:r>
-        <w:tab/>
-      </w:r>
-      <w:r>
-        <w:rPr>
-          <w:rFonts w:ascii="Calibri" w:hAnsi="Calibri" w:cs="Calibri"/>
-        </w:rPr>
-        <w:t>🟡</w:t>
-      </w:r>
-      <w:r>
-        <w:t xml:space="preserve"> Medium</w:t>
-      </w:r>
-    </w:p>
-    <w:p>
-      <w:pPr>
-        <w:pStyle w:val="ListParagraph"/>
-        <w:numPr>
-          <w:ilvl w:val="0"/>
-          <w:numId w:val="40"/>
-        </w:numPr>
-      </w:pPr>
-      <w:r>
-        <w:t xml:space="preserve">Construct Binary Tree from </w:t>
-      </w:r>
-      <w:proofErr w:type="spellStart"/>
-      <w:r>
-        <w:t>Preorder</w:t>
-      </w:r>
-      <w:proofErr w:type="spellEnd"/>
-      <w:r>
-        <w:t xml:space="preserve"> &amp; </w:t>
-      </w:r>
-      <w:proofErr w:type="spellStart"/>
-      <w:r>
-        <w:t>Postorder</w:t>
-      </w:r>
-      <w:proofErr w:type="spellEnd"/>
-      <w:r>
-        <w:t xml:space="preserve"> (889)</w:t>
-      </w:r>
-      <w:r>
-        <w:tab/>
-      </w:r>
-      <w:proofErr w:type="spellStart"/>
-      <w:r>
-        <w:t>LeetCode</w:t>
-      </w:r>
-      <w:proofErr w:type="spellEnd"/>
-      <w:r>
-        <w:tab/>
-      </w:r>
-      <w:r>
-        <w:rPr>
-          <w:rFonts w:ascii="Calibri" w:hAnsi="Calibri" w:cs="Calibri"/>
-        </w:rPr>
-        <w:t>🟡</w:t>
-      </w:r>
-      <w:r>
-        <w:t xml:space="preserve"> Medium</w:t>
-      </w:r>
-    </w:p>
-    <w:p>
-      <w:pPr>
-        <w:pStyle w:val="ListParagraph"/>
-        <w:numPr>
-          <w:ilvl w:val="0"/>
-          <w:numId w:val="40"/>
-        </w:numPr>
-      </w:pPr>
-      <w:r>
-        <w:t xml:space="preserve">Recover a Tree From </w:t>
-      </w:r>
-      <w:proofErr w:type="spellStart"/>
-      <w:r>
-        <w:t>Preorder</w:t>
-      </w:r>
-      <w:proofErr w:type="spellEnd"/>
-      <w:r>
-        <w:t xml:space="preserve"> Traversal (1028)</w:t>
-      </w:r>
-      <w:r>
-        <w:tab/>
-      </w:r>
-      <w:proofErr w:type="spellStart"/>
-      <w:r>
-        <w:t>LeetCode</w:t>
-      </w:r>
-      <w:proofErr w:type="spellEnd"/>
-      <w:r>
-        <w:tab/>
-      </w:r>
-      <w:r>
-        <w:rPr>
-          <w:rFonts w:ascii="Segoe UI Symbol" w:hAnsi="Segoe UI Symbol" w:cs="Segoe UI Symbol"/>
-        </w:rPr>
-        <w:t>🔴</w:t>
-      </w:r>
-      <w:r>
-        <w:t xml:space="preserve"> Hard</w:t>
-      </w:r>
-    </w:p>
-    <w:p>
-      <w:pPr>
-        <w:pStyle w:val="ListParagraph"/>
-        <w:numPr>
-          <w:ilvl w:val="0"/>
-          <w:numId w:val="40"/>
-        </w:numPr>
-      </w:pPr>
-      <w:r>
-        <w:t>Convert Binary Tree to Doubly Linked List</w:t>
-      </w:r>
-      <w:r>
-        <w:tab/>
-      </w:r>
-      <w:proofErr w:type="spellStart"/>
-      <w:r>
-        <w:t>GeeksforGeeks</w:t>
-      </w:r>
-      <w:proofErr w:type="spellEnd"/>
-      <w:r>
-        <w:tab/>
-      </w:r>
-      <w:r>
-        <w:rPr>
-          <w:rFonts w:ascii="Calibri" w:hAnsi="Calibri" w:cs="Calibri"/>
-        </w:rPr>
-        <w:t>🟡</w:t>
-      </w:r>
-    </w:p>
-    <w:p>
-      <w:pPr>
-        <w:pStyle w:val="ListParagraph"/>
-        <w:numPr>
-          <w:ilvl w:val="0"/>
-          <w:numId w:val="40"/>
-        </w:numPr>
-      </w:pPr>
-      <w:r>
-        <w:t>Flatten Binary Tree to Linked List (114)</w:t>
-      </w:r>
-      <w:r>
-        <w:tab/>
-      </w:r>
-      <w:proofErr w:type="spellStart"/>
-      <w:r>
-        <w:t>LeetCode</w:t>
-      </w:r>
-      <w:proofErr w:type="spellEnd"/>
-      <w:r>
-        <w:tab/>
-      </w:r>
-      <w:r>
-        <w:rPr>
-          <w:rFonts w:ascii="Calibri" w:hAnsi="Calibri" w:cs="Calibri"/>
-        </w:rPr>
-        <w:t>🟡</w:t>
-      </w:r>
-      <w:r>
-        <w:t xml:space="preserve"> Medium</w:t>
-      </w:r>
-    </w:p>
-    <w:p>
-      <w:pPr>
-        <w:pStyle w:val="ListParagraph"/>
-        <w:numPr>
-          <w:ilvl w:val="0"/>
-          <w:numId w:val="40"/>
-        </w:numPr>
-      </w:pPr>
-      <w:r>
-        <w:t>Populating Next Right Pointers in Each Node (116)</w:t>
-      </w:r>
-      <w:r>
-        <w:tab/>
-      </w:r>
-      <w:proofErr w:type="spellStart"/>
-      <w:r>
-        <w:t>LeetCode</w:t>
-      </w:r>
-      <w:proofErr w:type="spellEnd"/>
-      <w:r>
-        <w:tab/>
-      </w:r>
-      <w:r>
-        <w:rPr>
-          <w:rFonts w:ascii="Calibri" w:hAnsi="Calibri" w:cs="Calibri"/>
-        </w:rPr>
-        <w:t>🟡</w:t>
-      </w:r>
-      <w:r>
-        <w:t xml:space="preserve"> Medium</w:t>
-      </w:r>
-    </w:p>
-    <w:p>
-      <w:pPr>
-        <w:pStyle w:val="ListParagraph"/>
-        <w:numPr>
-          <w:ilvl w:val="0"/>
-          <w:numId w:val="40"/>
-        </w:numPr>
-      </w:pPr>
-      <w:r>
-        <w:t>Populating Next Right Pointers II (117)</w:t>
-      </w:r>
-      <w:r>
-        <w:tab/>
-      </w:r>
-      <w:proofErr w:type="spellStart"/>
-      <w:r>
-        <w:t>LeetCode</w:t>
-      </w:r>
-      <w:proofErr w:type="spellEnd"/>
-      <w:r>
-        <w:tab/>
-      </w:r>
-      <w:r>
-        <w:rPr>
-          <w:rFonts w:ascii="Calibri" w:hAnsi="Calibri" w:cs="Calibri"/>
-        </w:rPr>
-        <w:t>🟡</w:t>
-      </w:r>
-      <w:r>
-        <w:t xml:space="preserve"> Medium</w:t>
-      </w:r>
-    </w:p>
-    <w:p>
-      <w:pPr>
-        <w:pStyle w:val="ListParagraph"/>
-        <w:numPr>
-          <w:ilvl w:val="0"/>
-          <w:numId w:val="40"/>
-        </w:numPr>
-      </w:pPr>
-      <w:r>
-        <w:t xml:space="preserve">Serialize and </w:t>
-      </w:r>
-      <w:proofErr w:type="spellStart"/>
-      <w:r>
-        <w:t>Deserialize</w:t>
-      </w:r>
-      <w:proofErr w:type="spellEnd"/>
-      <w:r>
-        <w:t xml:space="preserve"> Binary Tree (297)</w:t>
-      </w:r>
-      <w:r>
-        <w:tab/>
-      </w:r>
-      <w:proofErr w:type="spellStart"/>
-      <w:r>
-        <w:t>LeetCode</w:t>
-      </w:r>
-      <w:proofErr w:type="spellEnd"/>
-      <w:r>
-        <w:tab/>
-      </w:r>
-      <w:r>
-        <w:rPr>
-          <w:rFonts w:ascii="Segoe UI Symbol" w:hAnsi="Segoe UI Symbol" w:cs="Segoe UI Symbol"/>
-        </w:rPr>
-        <w:t>🔴</w:t>
-      </w:r>
-      <w:r>
-        <w:t xml:space="preserve"> Hard</w:t>
-      </w:r>
-    </w:p>
-    <w:p>
-      <w:pPr>
-        <w:pStyle w:val="ListParagraph"/>
-        <w:numPr>
-          <w:ilvl w:val="0"/>
-          <w:numId w:val="40"/>
-        </w:numPr>
-      </w:pPr>
-      <w:r>
-        <w:t xml:space="preserve">Serialize and </w:t>
-      </w:r>
-      <w:proofErr w:type="spellStart"/>
-      <w:r>
-        <w:t>Deserialize</w:t>
-      </w:r>
-      <w:proofErr w:type="spellEnd"/>
-      <w:r>
-        <w:t xml:space="preserve"> BST (449)</w:t>
-      </w:r>
-      <w:r>
-        <w:tab/>
-      </w:r>
-      <w:proofErr w:type="spellStart"/>
-      <w:r>
-        <w:t>LeetCode</w:t>
-      </w:r>
-      <w:proofErr w:type="spellEnd"/>
-      <w:r>
-        <w:tab/>
-      </w:r>
-      <w:r>
-        <w:rPr>
-          <w:rFonts w:ascii="Calibri" w:hAnsi="Calibri" w:cs="Calibri"/>
-        </w:rPr>
-        <w:t>🟡</w:t>
-      </w:r>
-      <w:r>
-        <w:t xml:space="preserve"> Medium</w:t>
-      </w:r>
-      <w:r>
-        <w:tab/>
-      </w:r>
-      <w:r>
-        <w:tab/>
-      </w:r>
-    </w:p>
-    <w:p/>
     <w:p>
       <w:pPr>
         <w:pStyle w:val="Heading2"/>
@@ -16603,7 +16537,7 @@
                     </pic:cNvPicPr>
                   </pic:nvPicPr>
                   <pic:blipFill>
-                    <a:blip r:embed="rId30" cstate="print">
+                    <a:blip r:embed="rId31" cstate="print">
                       <a:extLst>
                         <a:ext uri="{28A0092B-C50C-407E-A947-70E740481C1C}">
                           <a14:useLocalDpi xmlns:a14="http://schemas.microsoft.com/office/drawing/2010/main" val="0"/>
@@ -16681,7 +16615,7 @@
       <w:r>
         <w:t xml:space="preserve">Ques: </w:t>
       </w:r>
-      <w:hyperlink r:id="rId31" w:history="1">
+      <w:hyperlink r:id="rId32" w:history="1">
         <w:r>
           <w:rPr>
             <w:rStyle w:val="Hyperlink"/>
@@ -32209,7 +32143,7 @@
       <w:pPr>
         <w:pStyle w:val="ListParagraph"/>
       </w:pPr>
-      <w:hyperlink r:id="rId32" w:history="1">
+      <w:hyperlink r:id="rId33" w:history="1">
         <w:r>
           <w:rPr>
             <w:rStyle w:val="Hyperlink"/>
@@ -42834,7 +42768,7 @@
         </w:tabs>
         <w:spacing w:after="160" w:line="259" w:lineRule="auto"/>
       </w:pPr>
-      <w:hyperlink r:id="rId33" w:history="1">
+      <w:hyperlink r:id="rId34" w:history="1">
         <w:r>
           <w:rPr>
             <w:rStyle w:val="Hyperlink"/>
@@ -42862,7 +42796,7 @@
             <wp:extent cx="2127956" cy="1595968"/>
             <wp:effectExtent l="0" t="0" r="5715" b="4445"/>
             <wp:docPr id="8" name="Video 8">
-              <a:hlinkClick xmlns:a="http://schemas.openxmlformats.org/drawingml/2006/main" r:id="rId34"/>
+              <a:hlinkClick xmlns:a="http://schemas.openxmlformats.org/drawingml/2006/main" r:id="rId35"/>
             </wp:docPr>
             <wp:cNvGraphicFramePr>
               <a:graphicFrameLocks xmlns:a="http://schemas.openxmlformats.org/drawingml/2006/main" noChangeAspect="1"/>
@@ -42875,7 +42809,7 @@
                     <pic:cNvPicPr/>
                   </pic:nvPicPr>
                   <pic:blipFill>
-                    <a:blip r:embed="rId35">
+                    <a:blip r:embed="rId36">
                       <a:extLst>
                         <a:ext uri="{28A0092B-C50C-407E-A947-70E740481C1C}">
                           <a14:useLocalDpi xmlns:a14="http://schemas.microsoft.com/office/drawing/2010/main" val="0"/>
@@ -44334,7 +44268,7 @@
         </w:tabs>
         <w:spacing w:after="160" w:line="259" w:lineRule="auto"/>
       </w:pPr>
-      <w:hyperlink r:id="rId36" w:history="1">
+      <w:hyperlink r:id="rId37" w:history="1">
         <w:r>
           <w:rPr>
             <w:rStyle w:val="Hyperlink"/>
@@ -45758,7 +45692,7 @@
           <w:u w:val="single"/>
         </w:rPr>
       </w:pPr>
-      <w:hyperlink r:id="rId37" w:history="1">
+      <w:hyperlink r:id="rId38" w:history="1">
         <w:r>
           <w:rPr>
             <w:rStyle w:val="Hyperlink"/>
@@ -45766,68 +45700,6 @@
           <w:t>Solution</w:t>
         </w:r>
       </w:hyperlink>
-    </w:p>
-    <w:p>
-      <w:pPr>
-        <w:pStyle w:val="Header"/>
-        <w:tabs>
-          <w:tab w:val="clear" w:pos="4513"/>
-          <w:tab w:val="clear" w:pos="9026"/>
-        </w:tabs>
-        <w:spacing w:after="160" w:line="259" w:lineRule="auto"/>
-      </w:pPr>
-      <w:r>
-        <w:rPr>
-          <w:noProof/>
-          <w:lang w:eastAsia="en-IN"/>
-        </w:rPr>
-        <w:drawing>
-          <wp:inline distT="0" distB="0" distL="0" distR="0" wp14:anchorId="7DCC0CEF" wp14:editId="0F8074CE">
-            <wp:extent cx="2383809" cy="1787857"/>
-            <wp:effectExtent l="0" t="0" r="0" b="3175"/>
-            <wp:docPr id="7" name="Video 7">
-              <a:hlinkClick xmlns:a="http://schemas.openxmlformats.org/drawingml/2006/main" r:id="rId38"/>
-            </wp:docPr>
-            <wp:cNvGraphicFramePr>
-              <a:graphicFrameLocks xmlns:a="http://schemas.openxmlformats.org/drawingml/2006/main" noChangeAspect="1"/>
-            </wp:cNvGraphicFramePr>
-            <a:graphic xmlns:a="http://schemas.openxmlformats.org/drawingml/2006/main">
-              <a:graphicData uri="http://schemas.openxmlformats.org/drawingml/2006/picture">
-                <pic:pic xmlns:pic="http://schemas.openxmlformats.org/drawingml/2006/picture">
-                  <pic:nvPicPr>
-                    <pic:cNvPr id="7" name=""/>
-                    <pic:cNvPicPr/>
-                  </pic:nvPicPr>
-                  <pic:blipFill>
-                    <a:blip r:embed="rId39">
-                      <a:extLst>
-                        <a:ext uri="{28A0092B-C50C-407E-A947-70E740481C1C}">
-                          <a14:useLocalDpi xmlns:a14="http://schemas.microsoft.com/office/drawing/2010/main" val="0"/>
-                        </a:ext>
-                        <a:ext uri="{C809E66F-F1BF-436E-b5F7-EEA9579F0CBA}">
-                          <wp15:webVideoPr xmlns:wp15="http://schemas.microsoft.com/office/word/2012/wordprocessingDrawing" embeddedHtml="&lt;iframe id=&quot;ytplayer&quot; src=&quot;https://www.youtube.com/embed/bkxqA8Rfv04&quot; frameborder=&quot;0&quot; type=&quot;text/html&quot; width=&quot;816&quot; height=&quot;480&quot; /&gt;" h="480" w="816"/>
-                        </a:ext>
-                      </a:extLst>
-                    </a:blip>
-                    <a:stretch>
-                      <a:fillRect/>
-                    </a:stretch>
-                  </pic:blipFill>
-                  <pic:spPr>
-                    <a:xfrm>
-                      <a:off x="0" y="0"/>
-                      <a:ext cx="2425881" cy="1819411"/>
-                    </a:xfrm>
-                    <a:prstGeom prst="rect">
-                      <a:avLst/>
-                    </a:prstGeom>
-                  </pic:spPr>
-                </pic:pic>
-              </a:graphicData>
-            </a:graphic>
-          </wp:inline>
-        </w:drawing>
-      </w:r>
     </w:p>
     <w:p>
       <w:pPr>
@@ -47410,7 +47282,6 @@
           <w:szCs w:val="21"/>
           <w:lang w:eastAsia="en-IN"/>
         </w:rPr>
-        <w:lastRenderedPageBreak/>
         <w:t xml:space="preserve">        </w:t>
       </w:r>
       <w:proofErr w:type="gramStart"/>
@@ -48457,6 +48328,7 @@
           <w:szCs w:val="21"/>
           <w:lang w:eastAsia="en-IN"/>
         </w:rPr>
+        <w:lastRenderedPageBreak/>
         <w:t xml:space="preserve">    </w:t>
       </w:r>
       <w:proofErr w:type="spellStart"/>
@@ -51078,7 +50950,6 @@
           <w:szCs w:val="21"/>
           <w:lang w:eastAsia="en-IN"/>
         </w:rPr>
-        <w:lastRenderedPageBreak/>
         <w:t xml:space="preserve">            </w:t>
       </w:r>
       <w:proofErr w:type="gramStart"/>
@@ -53582,7 +53453,7 @@
       </w:pPr>
     </w:p>
     <w:sectPr>
-      <w:footerReference w:type="default" r:id="rId40"/>
+      <w:footerReference w:type="default" r:id="rId39"/>
       <w:pgSz w:w="11906" w:h="16838" w:code="9"/>
       <w:pgMar w:top="720" w:right="720" w:bottom="720" w:left="720" w:header="0" w:footer="283" w:gutter="0"/>
       <w:cols w:space="708"/>
@@ -53666,7 +53537,7 @@
         <w:noProof/>
         <w:color w:val="404040" w:themeColor="text1" w:themeTint="BF"/>
       </w:rPr>
-      <w:t>25</w:t>
+      <w:t>20</w:t>
     </w:r>
     <w:r>
       <w:rPr>
@@ -58873,7 +58744,7 @@
 </file>
 
 <file path=customXml/itemProps1.xml><?xml version="1.0" encoding="utf-8"?>
-<ds:datastoreItem xmlns:ds="http://schemas.openxmlformats.org/officeDocument/2006/customXml" ds:itemID="{0270E42B-D710-47A4-AB34-0A28D27E4250}">
+<ds:datastoreItem xmlns:ds="http://schemas.openxmlformats.org/officeDocument/2006/customXml" ds:itemID="{1DB22265-2231-44E4-AA59-EF852EAB3312}">
   <ds:schemaRefs>
     <ds:schemaRef ds:uri="http://schemas.openxmlformats.org/officeDocument/2006/bibliography"/>
   </ds:schemaRefs>

</xml_diff>

<commit_message>
Tree: Tree construction started
</commit_message>
<xml_diff>
--- a/07. Tree/Tree.docx
+++ b/07. Tree/Tree.docx
@@ -11467,6 +11467,7 @@
         </w:numPr>
         <w:rPr>
           <w:bCs/>
+          <w:color w:val="FF0000"/>
         </w:rPr>
       </w:pPr>
       <w:r>
@@ -11726,13 +11727,53 @@
     <w:p>
       <w:pPr>
         <w:pStyle w:val="ListParagraph"/>
-        <w:rPr>
-          <w:bCs/>
+        <w:numPr>
+          <w:ilvl w:val="0"/>
+          <w:numId w:val="41"/>
+        </w:numPr>
+        <w:rPr>
           <w:color w:val="FF0000"/>
         </w:rPr>
       </w:pPr>
-      <w:bookmarkStart w:id="30" w:name="_GoBack"/>
-      <w:bookmarkEnd w:id="30"/>
+      <w:r>
+        <w:rPr>
+          <w:color w:val="FF0000"/>
+        </w:rPr>
+        <w:t>Lowest Common Ancestor of a Binary Tree (236)</w:t>
+      </w:r>
+      <w:r>
+        <w:rPr>
+          <w:color w:val="FF0000"/>
+        </w:rPr>
+        <w:tab/>
+      </w:r>
+      <w:proofErr w:type="spellStart"/>
+      <w:r>
+        <w:rPr>
+          <w:color w:val="FF0000"/>
+        </w:rPr>
+        <w:t>LeetCode</w:t>
+      </w:r>
+      <w:proofErr w:type="spellEnd"/>
+      <w:r>
+        <w:rPr>
+          <w:color w:val="FF0000"/>
+        </w:rPr>
+        <w:tab/>
+      </w:r>
+      <w:r>
+        <w:rPr>
+          <w:rFonts w:ascii="Calibri" w:hAnsi="Calibri" w:cs="Calibri"/>
+          <w:color w:val="FF0000"/>
+        </w:rPr>
+        <w:t>🟡</w:t>
+      </w:r>
+      <w:r>
+        <w:rPr>
+          <w:color w:val="FF0000"/>
+        </w:rPr>
+        <w:t xml:space="preserve"> Medium</w:t>
+      </w:r>
     </w:p>
     <w:p>
       <w:pPr>
@@ -11741,92 +11782,47 @@
           <w:ilvl w:val="0"/>
           <w:numId w:val="41"/>
         </w:numPr>
-      </w:pPr>
-      <w:r>
+        <w:rPr>
+          <w:color w:val="FF0000"/>
+        </w:rPr>
+      </w:pPr>
+      <w:r>
+        <w:rPr>
+          <w:color w:val="FF0000"/>
+        </w:rPr>
         <w:t>Lowest Common Ancestor of a BST (235)</w:t>
       </w:r>
       <w:r>
+        <w:rPr>
+          <w:color w:val="FF0000"/>
+        </w:rPr>
         <w:tab/>
       </w:r>
       <w:proofErr w:type="spellStart"/>
       <w:r>
+        <w:rPr>
+          <w:color w:val="FF0000"/>
+        </w:rPr>
         <w:t>LeetCode</w:t>
       </w:r>
       <w:proofErr w:type="spellEnd"/>
       <w:r>
+        <w:rPr>
+          <w:color w:val="FF0000"/>
+        </w:rPr>
         <w:tab/>
       </w:r>
       <w:r>
         <w:rPr>
           <w:rFonts w:ascii="Calibri" w:hAnsi="Calibri" w:cs="Calibri"/>
+          <w:color w:val="FF0000"/>
         </w:rPr>
         <w:t>🟡</w:t>
       </w:r>
       <w:r>
-        <w:t xml:space="preserve"> Medium</w:t>
-      </w:r>
-    </w:p>
-    <w:p>
-      <w:pPr>
-        <w:pStyle w:val="ListParagraph"/>
-        <w:numPr>
-          <w:ilvl w:val="0"/>
-          <w:numId w:val="41"/>
-        </w:numPr>
-      </w:pPr>
-      <w:r>
-        <w:t>Lowest Common Ancestor of a Binary Tree (236)</w:t>
-      </w:r>
-      <w:r>
-        <w:tab/>
-      </w:r>
-      <w:proofErr w:type="spellStart"/>
-      <w:r>
-        <w:t>LeetCode</w:t>
-      </w:r>
-      <w:proofErr w:type="spellEnd"/>
-      <w:r>
-        <w:tab/>
-      </w:r>
-      <w:r>
-        <w:rPr>
-          <w:rFonts w:ascii="Calibri" w:hAnsi="Calibri" w:cs="Calibri"/>
-        </w:rPr>
-        <w:t>🟡</w:t>
-      </w:r>
-      <w:r>
-        <w:t xml:space="preserve"> Medium</w:t>
-      </w:r>
-    </w:p>
-    <w:p>
-      <w:pPr>
-        <w:pStyle w:val="ListParagraph"/>
-        <w:numPr>
-          <w:ilvl w:val="0"/>
-          <w:numId w:val="41"/>
-        </w:numPr>
-      </w:pPr>
-      <w:r>
-        <w:t>Step-By-Step Directions From a Binary Tree Node to Another (2096)</w:t>
-      </w:r>
-      <w:r>
-        <w:tab/>
-      </w:r>
-      <w:proofErr w:type="spellStart"/>
-      <w:r>
-        <w:t>LeetCode</w:t>
-      </w:r>
-      <w:proofErr w:type="spellEnd"/>
-      <w:r>
-        <w:tab/>
-      </w:r>
-      <w:r>
-        <w:rPr>
-          <w:rFonts w:ascii="Calibri" w:hAnsi="Calibri" w:cs="Calibri"/>
-        </w:rPr>
-        <w:t>🟡</w:t>
-      </w:r>
-      <w:r>
+        <w:rPr>
+          <w:color w:val="FF0000"/>
+        </w:rPr>
         <w:t xml:space="preserve"> Medium</w:t>
       </w:r>
     </w:p>
@@ -11867,46 +11863,87 @@
           <w:ilvl w:val="0"/>
           <w:numId w:val="40"/>
         </w:numPr>
-      </w:pPr>
-      <w:r>
+        <w:rPr>
+          <w:color w:val="FF0000"/>
+        </w:rPr>
+      </w:pPr>
+      <w:r>
+        <w:rPr>
+          <w:color w:val="FF0000"/>
+        </w:rPr>
         <w:t xml:space="preserve">Construct Binary Tree from </w:t>
       </w:r>
       <w:proofErr w:type="spellStart"/>
       <w:r>
+        <w:rPr>
+          <w:color w:val="FF0000"/>
+        </w:rPr>
         <w:t>Preorder</w:t>
       </w:r>
       <w:proofErr w:type="spellEnd"/>
       <w:r>
+        <w:rPr>
+          <w:color w:val="FF0000"/>
+        </w:rPr>
         <w:t xml:space="preserve"> and </w:t>
       </w:r>
       <w:proofErr w:type="spellStart"/>
       <w:r>
+        <w:rPr>
+          <w:color w:val="FF0000"/>
+        </w:rPr>
         <w:t>Inorder</w:t>
       </w:r>
       <w:proofErr w:type="spellEnd"/>
       <w:r>
+        <w:rPr>
+          <w:color w:val="FF0000"/>
+        </w:rPr>
         <w:t xml:space="preserve"> Traversal (105)</w:t>
       </w:r>
       <w:r>
+        <w:rPr>
+          <w:color w:val="FF0000"/>
+        </w:rPr>
         <w:tab/>
       </w:r>
       <w:proofErr w:type="spellStart"/>
       <w:r>
+        <w:rPr>
+          <w:color w:val="FF0000"/>
+        </w:rPr>
         <w:t>LeetCode</w:t>
       </w:r>
       <w:proofErr w:type="spellEnd"/>
       <w:r>
+        <w:rPr>
+          <w:color w:val="FF0000"/>
+        </w:rPr>
         <w:tab/>
       </w:r>
       <w:r>
         <w:rPr>
           <w:rFonts w:ascii="Calibri" w:hAnsi="Calibri" w:cs="Calibri"/>
+          <w:color w:val="FF0000"/>
         </w:rPr>
         <w:t>🟡</w:t>
       </w:r>
       <w:r>
+        <w:rPr>
+          <w:color w:val="FF0000"/>
+        </w:rPr>
         <w:t xml:space="preserve"> Medium</w:t>
       </w:r>
+    </w:p>
+    <w:p>
+      <w:pPr>
+        <w:pStyle w:val="ListParagraph"/>
+        <w:rPr>
+          <w:color w:val="FF0000"/>
+        </w:rPr>
+      </w:pPr>
+      <w:bookmarkStart w:id="30" w:name="_GoBack"/>
+      <w:bookmarkEnd w:id="30"/>
     </w:p>
     <w:p>
       <w:pPr>
@@ -12499,6 +12536,11 @@
     </w:p>
     <w:p>
       <w:pPr>
+        <w:pStyle w:val="ListParagraph"/>
+      </w:pPr>
+    </w:p>
+    <w:p>
+      <w:pPr>
         <w:pStyle w:val="Heading2"/>
         <w:rPr>
           <w:b/>
@@ -12814,6 +12856,7 @@
         <w:t xml:space="preserve"> Hard</w:t>
       </w:r>
     </w:p>
+    <w:p/>
     <w:p>
       <w:pPr>
         <w:pStyle w:val="Heading1"/>
@@ -53537,7 +53580,7 @@
         <w:noProof/>
         <w:color w:val="404040" w:themeColor="text1" w:themeTint="BF"/>
       </w:rPr>
-      <w:t>20</w:t>
+      <w:t>21</w:t>
     </w:r>
     <w:r>
       <w:rPr>
@@ -58744,7 +58787,7 @@
 </file>
 
 <file path=customXml/itemProps1.xml><?xml version="1.0" encoding="utf-8"?>
-<ds:datastoreItem xmlns:ds="http://schemas.openxmlformats.org/officeDocument/2006/customXml" ds:itemID="{1DB22265-2231-44E4-AA59-EF852EAB3312}">
+<ds:datastoreItem xmlns:ds="http://schemas.openxmlformats.org/officeDocument/2006/customXml" ds:itemID="{4618CE78-9618-4B42-A92F-2C58687264E2}">
   <ds:schemaRefs>
     <ds:schemaRef ds:uri="http://schemas.openxmlformats.org/officeDocument/2006/bibliography"/>
   </ds:schemaRefs>

</xml_diff>